<commit_message>
feat: restore complete V1 document experience
</commit_message>
<xml_diff>
--- a/src/vysion/reports/templates/generique.docx
+++ b/src/vysion/reports/templates/generique.docx
@@ -118,6 +118,7 @@
           <w:sz w:val="43"/>
           <w:szCs w:val="72"/>
         </w:rPr>
+        <w:t>NOM CLIENT</w:t>
       </w:r>
     </w:p>
     <w:p>
@@ -3516,6 +3517,13 @@
         </w:tc>
       </w:tr>
     </w:tbl>
+    <w:p/>
+    <w:p/>
+    <w:p/>
+    <w:p/>
+    <w:p/>
+    <w:p/>
+    <w:p/>
     <w:sectPr>
       <w:headerReference w:type="even" r:id="rId11"/>
       <w:headerReference w:type="default" r:id="rId12"/>

</xml_diff>